<commit_message>
Updated simulation analysis and presentation gen scripts
</commit_message>
<xml_diff>
--- a/assets/windows/wsmart_route_results.docx
+++ b/assets/windows/wsmart_route_results.docx
@@ -12,12 +12,12 @@
     </w:p>
     <w:p>
       <w:r>
-        <w:t xml:space="preserve">WSmart+ Route — Adaptive Routing Policies for Smart Waste Collection</w:t>
+        <w:t xml:space="preserve">A Simulation Framework for the Multi-Period Vehicle Routing Problem with Profits in Smart Waste Collection</w:t>
       </w:r>
     </w:p>
     <w:p>
       <w:r>
-        <w:t xml:space="preserve">Generated for: Afonso Fernandes</w:t>
+        <w:t xml:space="preserve">Generated for: Afonso Cruz Fernandes¹</w:t>
       </w:r>
     </w:p>
     <w:p/>
@@ -31,12 +31,12 @@
         <w:pStyle w:val="Heading2"/>
       </w:pPr>
       <w:r>
-        <w:t xml:space="preserve">Slide 1 — WSmart+ Route — Adaptive Routing Policies for Smart Waste Collection</w:t>
+        <w:t xml:space="preserve">Slide 1 — A Simulation Framework for the Multi-Period Vehicle Routing Problem with Profits in Smart Waste Collection</w:t>
       </w:r>
     </w:p>
     <w:p>
       <w:r>
-        <w:t xml:space="preserve">Presented by Afonso Fernandes.</w:t>
+        <w:t xml:space="preserve">Presented by Afonso Cruz Fernandes¹. With Héctor Bonilla-Londoño², Diana Jorge², Manuel Lopes¹, Pedro A. Santos¹, Tânia Ramos².</w:t>
       </w:r>
     </w:p>
     <w:p/>
@@ -55,7 +55,7 @@
     </w:p>
     <w:p>
       <w:r>
-        <w:t xml:space="preserve">Today's agenda: The Vehicle Routing Problem with Profits (VRPP); Routing Simulator Philosophy; Mandatory Node Selection Strategies; Exact Solvers: BPC  SWC-TCF; Meta-Heuristics  Hyper-Heuristics; Evolutionary Algorithms: HGS; Swarm Intelligence: PSOMA  ACO-HH; Neighborhood Search: SANS  PG-CLNS; Route Improvers: Classical Local Search vs Fast-TSP; Results — Pareto Front; Results — Summary KPI Analysis; Results — Per-Scenario Heatmaps; Results — Policy × Scenario Heatmaps (90 days); Results — Route Improver Comparison; Conclusions, Limitations  Future Work.</w:t>
+        <w:t xml:space="preserve">Today's agenda: Introduction — VRPP, Simulator Philosophy  Objective; Mandatory Node Selection Strategies; Route Constructors  Route Improvers; Results; Conclusions, Limitations  Future Work.</w:t>
       </w:r>
     </w:p>
     <w:p/>
@@ -104,7 +104,42 @@
         <w:pStyle w:val="Heading2"/>
       </w:pPr>
       <w:r>
-        <w:t xml:space="preserve">Slide 4 — Routing Simulator Philosophy — Modular Policy Pipeline</w:t>
+        <w:t xml:space="preserve">Slide 4 — Objective of this Work</w:t>
+      </w:r>
+    </w:p>
+    <w:p>
+      <w:r>
+        <w:t xml:space="preserve">Benchmark, under one simulation framework, the full space of daily routing policies for the multi-period VRPP in smart waste collection</w:t>
+        <w:br/>
+        <w:t xml:space="preserve"/>
+        <w:br/>
+        <w:t xml:space="preserve">Exact methods: Branch-Price-and-Cut (BPC) and SWC-TCF — optimality reference points at the daily-subproblem scale</w:t>
+        <w:br/>
+        <w:t xml:space="preserve"/>
+        <w:br/>
+        <w:t xml:space="preserve">Meta-heuristics: Hybrid Genetic Search (HGS), Adaptive Large Neighborhood Search (ALNS), Simulated Annealing Neighborhood Search (SANS), Policy-Gradient CLNS (PG-CLNS)</w:t>
+        <w:br/>
+        <w:t xml:space="preserve"/>
+        <w:br/>
+        <w:t xml:space="preserve">Hyper-heuristics: Particle Swarm Optimisation Memetic Algorithm (PSOMA) and Ant Colony Optimisation Hyper-Heuristic (ACO-HH)</w:t>
+        <w:br/>
+        <w:t xml:space="preserve"/>
+        <w:br/>
+        <w:t xml:space="preserve">Question: which combination of mandatory selection strategy, route constructor and route improver dominates the overflow vs kg/km trade-off, and how stable is that answer across scenarios and horizons?</w:t>
+      </w:r>
+    </w:p>
+    <w:p/>
+    <w:p>
+      <w:r>
+        <w:t xml:space="preserve"/>
+      </w:r>
+    </w:p>
+    <w:p>
+      <w:pPr>
+        <w:pStyle w:val="Heading2"/>
+      </w:pPr>
+      <w:r>
+        <w:t xml:space="preserve">Slide 5 — Routing Simulator Philosophy — Modular Policy Pipeline</w:t>
       </w:r>
     </w:p>
     <w:p>
@@ -131,7 +166,7 @@
         <w:pStyle w:val="Heading2"/>
       </w:pPr>
       <w:r>
-        <w:t xml:space="preserve">Slide 5 — Mandatory Node Selection Strategies</w:t>
+        <w:t xml:space="preserve">Slide 6 — Mandatory Node Selection Strategies</w:t>
       </w:r>
     </w:p>
     <w:p>
@@ -140,7 +175,7 @@
         <w:br/>
         <w:t xml:space="preserve"/>
         <w:br/>
-        <w:t xml:space="preserve">Look-Ahead anticipates predicted overflows; Last-Minute waits for a critical fill threshold; Service-Level bounds each bin's overflow probability</w:t>
+        <w:t xml:space="preserve">Look-Ahead (LA) anticipates predicted overflows; Last-Minute (LM) waits for a critical fill threshold; Service-Level (SL) bounds each bin's overflow probability</w:t>
         <w:br/>
         <w:t xml:space="preserve"/>
         <w:br/>
@@ -162,7 +197,34 @@
         <w:pStyle w:val="Heading2"/>
       </w:pPr>
       <w:r>
-        <w:t xml:space="preserve">Slide 6 — Exact Solvers: BPC  SWC-TCF</w:t>
+        <w:t xml:space="preserve">Slide 7 — Big Picture: Policy Configuration Space</w:t>
+      </w:r>
+    </w:p>
+    <w:p>
+      <w:r>
+        <w:t xml:space="preserve">Every simulated policy is one path through the three columns: a mandatory selection strategy, a route constructor (exact / meta-heuristic / hyper-heuristic) and an optional route improver.</w:t>
+        <w:br/>
+        <w:t xml:space="preserve"/>
+        <w:br/>
+        <w:t xml:space="preserve">Mandatory selection × route constructor × route improver — every combination is run through the same multi-day simulator</w:t>
+        <w:br/>
+        <w:t xml:space="preserve"/>
+        <w:br/>
+        <w:t xml:space="preserve">Exact methods and meta-/hyper-heuristics are interchangeable route constructors under the identical selection and improvement stages</w:t>
+      </w:r>
+    </w:p>
+    <w:p/>
+    <w:p>
+      <w:r>
+        <w:t xml:space="preserve"/>
+      </w:r>
+    </w:p>
+    <w:p>
+      <w:pPr>
+        <w:pStyle w:val="Heading2"/>
+      </w:pPr>
+      <w:r>
+        <w:t xml:space="preserve">Slide 8 — Exact Methods: BPC  SWC-TCF</w:t>
       </w:r>
     </w:p>
     <w:p>
@@ -197,7 +259,7 @@
         <w:pStyle w:val="Heading2"/>
       </w:pPr>
       <w:r>
-        <w:t xml:space="preserve">Slide 7 — Meta-Heuristics  Hyper-Heuristics — Overarching Philosophy</w:t>
+        <w:t xml:space="preserve">Slide 9 — Meta-Heuristics  Hyper-Heuristics — Overarching Philosophy</w:t>
       </w:r>
     </w:p>
     <w:p>
@@ -206,19 +268,23 @@
         <w:br/>
         <w:t xml:space="preserve"/>
         <w:br/>
-        <w:t xml:space="preserve">Heuristic search trades a small optimality gap for polynomial runtime — essential beyond the exact solvers' size limits</w:t>
+        <w:t xml:space="preserve">Heuristic search trades a small optimality gap for polynomial runtime — essential beyond the exact methods' size limits</w:t>
         <w:br/>
         <w:t xml:space="preserve"/>
         <w:br/>
-        <w:t xml:space="preserve">Meta-heuristics balance exploration (diversify, escape local optima) and exploitation (intensify, polish good solutions)</w:t>
+        <w:t xml:space="preserve">Evolutionary — HGS: population-based, ordered crossover + aggressive local search, biased fitness balances quality and diversity</w:t>
         <w:br/>
         <w:t xml:space="preserve"/>
         <w:br/>
-        <w:t xml:space="preserve">Hyper-heuristics search the space of heuristics itself, learning which low-level operator to apply next (e.g. ACO-HH)</w:t>
+        <w:t xml:space="preserve">Swarm intelligence — PSOMA: particle swarm + memetic refinement (best-overflow performer); ACO-HH: pheromones over low-level heuristics, most robust all-rounder</w:t>
         <w:br/>
         <w:t xml:space="preserve"/>
         <w:br/>
-        <w:t xml:space="preserve">Three families studied: evolutionary (HGS), swarm intelligence (PSOMA, ACO-HH), neighborhood search (SANS, PG-CLNS)</w:t>
+        <w:t xml:space="preserve">Trajectory-based — SANS: simulated annealing accepts worsening moves under a cooling schedule; PG-CLNS: destroy-and-repair LNS whose operator choice is learned via policy gradients</w:t>
+        <w:br/>
+        <w:t xml:space="preserve"/>
+        <w:br/>
+        <w:t xml:space="preserve">Three families, one shared interface: each plugs into the pipeline as an interchangeable route constructor</w:t>
       </w:r>
     </w:p>
     <w:p/>
@@ -232,112 +298,7 @@
         <w:pStyle w:val="Heading2"/>
       </w:pPr>
       <w:r>
-        <w:t xml:space="preserve">Slide 8 — Evolutionary Algorithms — HGS (Hybrid Genetic Search)</w:t>
-      </w:r>
-    </w:p>
-    <w:p>
-      <w:r>
-        <w:t xml:space="preserve">Biased fitness function used to rank current solutions by both quality and diversity. n_pop is the current population size and n_elite the number of elite (best-cost) individuals; individuals outside the elite are increasingly rewarded for contributing diversity.</w:t>
-        <w:br/>
-        <w:t xml:space="preserve"/>
-        <w:br/>
-        <w:t xml:space="preserve">Population-based: parents recombine via ordered crossover; every offspring is 'educated' by aggressive local search</w:t>
-        <w:br/>
-        <w:t xml:space="preserve"/>
-        <w:br/>
-        <w:t xml:space="preserve">Biased fitness (above) blends solution quality with diversity contribution — prevents premature convergence</w:t>
-        <w:br/>
-        <w:t xml:space="preserve"/>
-        <w:br/>
-        <w:t xml:space="preserve">Infeasible individuals survive in a penalised sub-population, letting the search cross infeasible regions</w:t>
-        <w:br/>
-        <w:t xml:space="preserve"/>
-        <w:br/>
-        <w:t xml:space="preserve">State-of-the-art on classical CVRP; strong efficiency performer here when paired with the CLS improver</w:t>
-      </w:r>
-    </w:p>
-    <w:p/>
-    <w:p>
-      <w:r>
-        <w:t xml:space="preserve"/>
-      </w:r>
-    </w:p>
-    <w:p>
-      <w:pPr>
-        <w:pStyle w:val="Heading2"/>
-      </w:pPr>
-      <w:r>
-        <w:t xml:space="preserve">Slide 9 — Swarm Intelligence — PSOMA  ACO-HH</w:t>
-      </w:r>
-    </w:p>
-    <w:p>
-      <w:r>
-        <w:t xml:space="preserve">PSO velocity update: particle i moves toward its personal best p_i and the global best g under inertia ω and acceleration coefficients c1, c2. ACO pheromone update: pheromone τ_h on heuristic h decays by evaporation rate ρ and is reinforced by the deposits Δτ_h of the k ants that used it.</w:t>
-        <w:br/>
-        <w:t xml:space="preserve"/>
-        <w:br/>
-        <w:t xml:space="preserve">Many simple agents share information; global order emerges from local interactions</w:t>
-        <w:br/>
-        <w:t xml:space="preserve"/>
-        <w:br/>
-        <w:t xml:space="preserve">PSOMA: particles attracted by personal/global bests + a memetic local-search refinement phase — consistent best-overflow performer in the empirical scenarios</w:t>
-        <w:br/>
-        <w:t xml:space="preserve"/>
-        <w:br/>
-        <w:t xml:space="preserve">ACO-HH: pheromones are laid over low-level heuristics (h) rather than arcs — the colony learns the best sequence of constructive operators</w:t>
-        <w:br/>
-        <w:t xml:space="preserve"/>
-        <w:br/>
-        <w:t xml:space="preserve">ACO-HH is the most robust all-rounder: Pareto-optimal in multiple scenarios (zero-overflow SL2 configs at FFZ-350)</w:t>
-      </w:r>
-    </w:p>
-    <w:p/>
-    <w:p>
-      <w:r>
-        <w:t xml:space="preserve"/>
-      </w:r>
-    </w:p>
-    <w:p>
-      <w:pPr>
-        <w:pStyle w:val="Heading2"/>
-      </w:pPr>
-      <w:r>
-        <w:t xml:space="preserve">Slide 10 — Neighborhood Search — SANS  PG-CLNS</w:t>
-      </w:r>
-    </w:p>
-    <w:p>
-      <w:r>
-        <w:t xml:space="preserve">Simulated annealing accepts a worsening move with probability e^(−Δ/T_t), cooling temperature T by factor γ each iteration. PG-CLNS learns its destroy/repair operator choice o via the policy-gradient estimator ∇_θJ, using state s (fill levels, geography) and observed reward R.</w:t>
-        <w:br/>
-        <w:t xml:space="preserve"/>
-        <w:br/>
-        <w:t xml:space="preserve">Trajectory-based: iteratively perturb the incumbent through neighbourhood moves</w:t>
-        <w:br/>
-        <w:t xml:space="preserve"/>
-        <w:br/>
-        <w:t xml:space="preserve">SANS: simulated annealing accepts worsening moves with probability e^(−Δ/T); cooling shifts exploration → exploitation</w:t>
-        <w:br/>
-        <w:t xml:space="preserve"/>
-        <w:br/>
-        <w:t xml:space="preserve">PG-CLNS: destroy-and-repair large-neighborhood search whose operator selection is learned online via policy gradients, adapting to instance context (fill levels, geography)</w:t>
-        <w:br/>
-        <w:t xml:space="preserve"/>
-        <w:br/>
-        <w:t xml:space="preserve">PG-CLNS is a standout overflow performer: SL1 + PG-CLNS reaches the Pareto front with ~1 overflow / 30 days</w:t>
-      </w:r>
-    </w:p>
-    <w:p/>
-    <w:p>
-      <w:r>
-        <w:t xml:space="preserve"/>
-      </w:r>
-    </w:p>
-    <w:p>
-      <w:pPr>
-        <w:pStyle w:val="Heading2"/>
-      </w:pPr>
-      <w:r>
-        <w:t xml:space="preserve">Slide 11 — Route Improvers: Classical Local Search vs Fast-TSP</w:t>
+        <w:t xml:space="preserve">Slide 10 — Route Improvers: Classical Local Search vs Fast-TSP</w:t>
       </w:r>
     </w:p>
     <w:p>
@@ -359,6 +320,33 @@
         <w:t xml:space="preserve"/>
         <w:br/>
         <w:t xml:space="preserve">Improver choice is a second-order effect: selection strategy and constructor dominate the KPI outcomes</w:t>
+      </w:r>
+    </w:p>
+    <w:p/>
+    <w:p>
+      <w:r>
+        <w:t xml:space="preserve"/>
+      </w:r>
+    </w:p>
+    <w:p>
+      <w:pPr>
+        <w:pStyle w:val="Heading2"/>
+      </w:pPr>
+      <w:r>
+        <w:t xml:space="preserve">Slide 11 — Design of Experiments</w:t>
+      </w:r>
+    </w:p>
+    <w:p>
+      <w:r>
+        <w:t xml:space="preserve">Every scenario (region × graph size × waste distribution) is simulated for both the 30-day and the 90-day horizon; the 90-day runs are restricted to the 30-day Pareto-front policies.</w:t>
+        <w:br/>
+        <w:t xml:space="preserve"/>
+        <w:br/>
+        <w:t xml:space="preserve">Regions/graph sizes: RM-100, RM-170 (Rio Maior), FFZ-350 (Figueira da Foz) — two waste distributions each: Empirical and Gamma-3</w:t>
+        <w:br/>
+        <w:t xml:space="preserve"/>
+        <w:br/>
+        <w:t xml:space="preserve">5 mandatory selection variants × 8 route constructors × up to 2 improvers, replicated at 30 and 90 days</w:t>
       </w:r>
     </w:p>
     <w:p/>
@@ -410,7 +398,26 @@
         <w:pStyle w:val="Heading2"/>
       </w:pPr>
       <w:r>
-        <w:t xml:space="preserve">Slide 14 — Results — Per-Scenario Heatmaps (Constructors × Strategy·Improver)</w:t>
+        <w:t xml:space="preserve">Slide 14 — Results — Strategy Trade-off (Overflows vs kg/km)</w:t>
+      </w:r>
+    </w:p>
+    <w:p>
+      <w:r>
+        <w:t xml:space="preserve">Each bubble = (selection strategy, scenario) averaged over constructors and improvers — coloured by mandatory selection strategy (LA/LM/SL).</w:t>
+      </w:r>
+    </w:p>
+    <w:p/>
+    <w:p>
+      <w:r>
+        <w:t xml:space="preserve"/>
+      </w:r>
+    </w:p>
+    <w:p>
+      <w:pPr>
+        <w:pStyle w:val="Heading2"/>
+      </w:pPr>
+      <w:r>
+        <w:t xml:space="preserve">Slide 15 — Results — Per-Scenario Heatmaps (Constructors × Strategy·Improver)</w:t>
       </w:r>
     </w:p>
     <w:p>
@@ -429,7 +436,7 @@
         <w:pStyle w:val="Heading2"/>
       </w:pPr>
       <w:r>
-        <w:t xml:space="preserve">Slide 15 — Results — Overflow  kg/km Heatmaps, 90 Days (Policies × Scenarios)</w:t>
+        <w:t xml:space="preserve">Slide 16 — Results — Overflow  kg/km Heatmaps, 90 Days (Policies × Scenarios)</w:t>
       </w:r>
     </w:p>
     <w:p>
@@ -448,7 +455,7 @@
         <w:pStyle w:val="Heading2"/>
       </w:pPr>
       <w:r>
-        <w:t xml:space="preserve">Slide 16 — Results — Route Improver Comparison</w:t>
+        <w:t xml:space="preserve">Slide 17 — Results — Route Improver Comparison</w:t>
       </w:r>
     </w:p>
     <w:p>
@@ -467,7 +474,7 @@
         <w:pStyle w:val="Heading2"/>
       </w:pPr>
       <w:r>
-        <w:t xml:space="preserve">Slide 17 — Results — Full Table (30-Day Horizon)</w:t>
+        <w:t xml:space="preserve">Slide 18 — Results — Full Table (30-Day Horizon)</w:t>
       </w:r>
     </w:p>
     <w:p>
@@ -486,7 +493,7 @@
         <w:pStyle w:val="Heading2"/>
       </w:pPr>
       <w:r>
-        <w:t xml:space="preserve">Slide 18 — Conclusions, Limitations  Future Work</w:t>
+        <w:t xml:space="preserve">Slide 19 — Conclusions, Limitations  Future Work</w:t>
       </w:r>
     </w:p>
     <w:p>
@@ -511,7 +518,7 @@
         <w:br/>
         <w:t xml:space="preserve"/>
         <w:br/>
-        <w:t xml:space="preserve">Future work: richer acceptance criteria, neural constructors in the same pipeline, multi-vehicle fleets, intra-day re-routing, CO₂-aware objectives</w:t>
+        <w:t xml:space="preserve">Future work: richer acceptance criteria, neural constructors (e.g. Attention Model) in the same pipeline, multi-vehicle fleets, intra-day re-routing, CO₂-aware objectives</w:t>
       </w:r>
     </w:p>
     <w:p/>
@@ -525,7 +532,7 @@
         <w:pStyle w:val="Heading2"/>
       </w:pPr>
       <w:r>
-        <w:t xml:space="preserve">Slide 19 — Thank You — Questions  Answers</w:t>
+        <w:t xml:space="preserve">Slide 20 — Thank You — Questions  Answers</w:t>
       </w:r>
     </w:p>
     <w:p>

</xml_diff>

<commit_message>
Updated analysis and presentation gen scripts
</commit_message>
<xml_diff>
--- a/assets/windows/wsmart_route_results.docx
+++ b/assets/windows/wsmart_route_results.docx
@@ -91,6 +91,22 @@
         <w:t xml:space="preserve"/>
         <w:br/>
         <w:t xml:space="preserve">Multi-day sequential decision problem over scenarios: RM-100, RM-170, FFZ-350 × {Empirical, Gamma-3} × {30, 90} days</w:t>
+        <w:br/>
+        <w:t xml:space="preserve"/>
+        <w:br/>
+        <w:t xml:space="preserve">The waste collection VRPP is a multi-day sequential decision problem: every day we decide which bins to visit (the mandatory selection) and in what order (the route), trading off the revenue from collected waste against the travel cost.</w:t>
+        <w:br/>
+        <w:t xml:space="preserve"/>
+        <w:br/>
+        <w:t xml:space="preserve">Bins fill stochastically between visits following an empirical or parametric distribution (Gamma-3). When a bin overflows, waste spills — a service failure we want to minimise.</w:t>
+        <w:br/>
+        <w:t xml:space="preserve"/>
+        <w:br/>
+        <w:t xml:space="preserve">The two KPIs are in direct tension: selecting fewer bins reduces km (higher KG/KM efficiency) but risks overflows; selecting more bins prevents overflows but drives up distance cost.</w:t>
+        <w:br/>
+        <w:t xml:space="preserve"/>
+        <w:br/>
+        <w:t xml:space="preserve">The policy π must make this trade-off optimally over D days and multiple scenarios — that is the core challenge we benchmark.</w:t>
       </w:r>
     </w:p>
     <w:p/>
@@ -138,6 +154,18 @@
         <w:t xml:space="preserve"/>
         <w:br/>
         <w:t xml:space="preserve">ACO-HH: Ant Colony Optimisation Hyper-Heuristic</w:t>
+        <w:br/>
+        <w:t xml:space="preserve"/>
+        <w:br/>
+        <w:t xml:space="preserve">The simulator collects five KPIs per run: (1) overflows — bins that exceed capacity, a service failure; (2) kg collected — total waste removed; (3) km driven — total vehicle distance; (4) KG/KM — efficiency ratio (kg per km driven); (5) profit — revenue from collected waste minus travel cost.</w:t>
+        <w:br/>
+        <w:t xml:space="preserve"/>
+        <w:br/>
+        <w:t xml:space="preserve">Every algorithm, exact or heuristic, runs under the same simulator and the same scenarios — this is what makes the comparison fair: identical demand realisations, identical KPI definitions, identical vehicle constraints.</w:t>
+        <w:br/>
+        <w:t xml:space="preserve"/>
+        <w:br/>
+        <w:t xml:space="preserve">The framework lets us ask: given the same mandatory selection strategy and the same daily scenario, how does BPC compare to HGS or ACO-HH on overflow prevention and route efficiency?</w:t>
       </w:r>
     </w:p>
     <w:p/>
@@ -345,7 +373,7 @@
         <w:pStyle w:val="Heading2"/>
       </w:pPr>
       <w:r>
-        <w:t xml:space="preserve">Slide 11 — Design of Experiments</w:t>
+        <w:t xml:space="preserve">Slide 11 — Experimental Methodology</w:t>
       </w:r>
     </w:p>
     <w:p>
@@ -429,12 +457,12 @@
         <w:pStyle w:val="Heading2"/>
       </w:pPr>
       <w:r>
-        <w:t xml:space="preserve">Slide 15 — Results — Per-Scenario Heatmaps (Constructors × Strategy·Improver)</w:t>
+        <w:t xml:space="preserve">Slide 15 — Results — Per-Scenario Heatmaps (Constructors × Strategy·Improver, Empirical Distribution)</w:t>
       </w:r>
     </w:p>
     <w:p>
       <w:r>
-        <w:t xml:space="preserve">30-day runs. One panel per scenario; route constructors on the rows, selection × improver combinations on the columns.</w:t>
+        <w:t xml:space="preserve">30-day runs, Empirical distribution only. One panel per scenario; route constructors on the rows, selection × improver combinations on the columns.</w:t>
       </w:r>
     </w:p>
     <w:p/>
@@ -491,7 +519,7 @@
     </w:p>
     <w:p>
       <w:r>
-        <w:t xml:space="preserve">Full results table, columns grouped by partitioned by mandatory selection strategy (LA, LM, SL), one partial table per value; each partial table then grouped by route constructor × route improver.</w:t>
+        <w:t xml:space="preserve">Full results table, columns grouped by partitioned by mandatory selection strategy (LA, LM, SL), one partial table per value; each partial table then grouped by route constructor × route improver. In each cell, left=overflows (lower is better), right=KG / KM (higher is better); best in bold green.</w:t>
       </w:r>
     </w:p>
     <w:p/>
@@ -544,7 +572,26 @@
         <w:pStyle w:val="Heading2"/>
       </w:pPr>
       <w:r>
-        <w:t xml:space="preserve">Slide 20 — Thank You — Questions  Answers</w:t>
+        <w:t xml:space="preserve">Slide 20 — Acknowledgements</w:t>
+      </w:r>
+    </w:p>
+    <w:p>
+      <w:r>
+        <w:t xml:space="preserve">This work was supported by FCT – Foundation for Science and Technology, I.P., under project 2022.04180.PTDC and individual PhD research grant - 2025.06860.BDANA</w:t>
+      </w:r>
+    </w:p>
+    <w:p/>
+    <w:p>
+      <w:r>
+        <w:t xml:space="preserve"/>
+      </w:r>
+    </w:p>
+    <w:p>
+      <w:pPr>
+        <w:pStyle w:val="Heading2"/>
+      </w:pPr>
+      <w:r>
+        <w:t xml:space="preserve">Slide 21 — Thank You — Questions  Answers</w:t>
       </w:r>
     </w:p>
     <w:p>

</xml_diff>